<commit_message>
Corrigir rota reset banco
</commit_message>
<xml_diff>
--- a/01 comando CMD.docx
+++ b/01 comando CMD.docx
@@ -21,8 +21,13 @@
         <w:t>duardo\</w:t>
       </w:r>
       <w:proofErr w:type="spellStart"/>
-      <w:r>
-        <w:t>clinica_odontologica</w:t>
+      <w:proofErr w:type="gramStart"/>
+      <w:r>
+        <w:t>clinica</w:t>
+      </w:r>
+      <w:proofErr w:type="gramEnd"/>
+      <w:r>
+        <w:t>_odontologica</w:t>
       </w:r>
       <w:proofErr w:type="spellEnd"/>
       <w:r>
@@ -40,8 +45,16 @@
         <w:rPr>
           <w:lang w:val="en-US"/>
         </w:rPr>
-        <w:t>git add .</w:t>
-      </w:r>
+        <w:t xml:space="preserve">git </w:t>
+      </w:r>
+      <w:proofErr w:type="gramStart"/>
+      <w:r>
+        <w:rPr>
+          <w:lang w:val="en-US"/>
+        </w:rPr>
+        <w:t>add .</w:t>
+      </w:r>
+      <w:proofErr w:type="gramEnd"/>
     </w:p>
     <w:p>
       <w:pPr>
@@ -181,7 +194,23 @@
           <w:b/>
           <w:bCs/>
         </w:rPr>
-        <w:t>"clinica-</w:t>
+        <w:t>"</w:t>
+      </w:r>
+      <w:proofErr w:type="gramStart"/>
+      <w:r>
+        <w:rPr>
+          <w:b/>
+          <w:bCs/>
+        </w:rPr>
+        <w:t>clinica</w:t>
+      </w:r>
+      <w:proofErr w:type="gramEnd"/>
+      <w:r>
+        <w:rPr>
+          <w:b/>
+          <w:bCs/>
+        </w:rPr>
+        <w:t>-</w:t>
       </w:r>
       <w:proofErr w:type="spellStart"/>
       <w:r>
@@ -323,14 +352,30 @@
           <w:b/>
           <w:bCs/>
         </w:rPr>
-        <w:t xml:space="preserve">Limpar Banco de Dados - </w:t>
-      </w:r>
-      <w:r>
-        <w:rPr>
-          <w:b/>
-          <w:bCs/>
-        </w:rPr>
-        <w:t xml:space="preserve"> Pelo terminal do Render</w:t>
+        <w:t xml:space="preserve">Limpar Banco de Dados </w:t>
+      </w:r>
+      <w:proofErr w:type="gramStart"/>
+      <w:r>
+        <w:rPr>
+          <w:b/>
+          <w:bCs/>
+        </w:rPr>
+        <w:t xml:space="preserve">- </w:t>
+      </w:r>
+      <w:r>
+        <w:rPr>
+          <w:b/>
+          <w:bCs/>
+        </w:rPr>
+        <w:t xml:space="preserve"> Pelo</w:t>
+      </w:r>
+      <w:proofErr w:type="gramEnd"/>
+      <w:r>
+        <w:rPr>
+          <w:b/>
+          <w:bCs/>
+        </w:rPr>
+        <w:t xml:space="preserve"> terminal do Render</w:t>
       </w:r>
     </w:p>
     <w:p>
@@ -421,11 +466,19 @@
       </w:r>
       <w:proofErr w:type="spellStart"/>
       <w:r>
-        <w:t>app.app_context</w:t>
+        <w:t>app.app_</w:t>
+      </w:r>
+      <w:proofErr w:type="gramStart"/>
+      <w:r>
+        <w:t>context</w:t>
       </w:r>
       <w:proofErr w:type="spellEnd"/>
       <w:r>
-        <w:t>():</w:t>
+        <w:t>(</w:t>
+      </w:r>
+      <w:proofErr w:type="gramEnd"/>
+      <w:r>
+        <w:t>):</w:t>
       </w:r>
     </w:p>
     <w:p>
@@ -436,12 +489,25 @@
         <w:t xml:space="preserve">...     </w:t>
       </w:r>
       <w:proofErr w:type="spellStart"/>
-      <w:r>
-        <w:t>db.drop_all</w:t>
+      <w:proofErr w:type="gramStart"/>
+      <w:r>
+        <w:t>db.drop</w:t>
+      </w:r>
+      <w:proofErr w:type="gramEnd"/>
+      <w:r>
+        <w:t>_</w:t>
+      </w:r>
+      <w:proofErr w:type="gramStart"/>
+      <w:r>
+        <w:t>all</w:t>
       </w:r>
       <w:proofErr w:type="spellEnd"/>
       <w:r>
-        <w:t>()</w:t>
+        <w:t>(</w:t>
+      </w:r>
+      <w:proofErr w:type="gramEnd"/>
+      <w:r>
+        <w:t>)</w:t>
       </w:r>
     </w:p>
     <w:p>
@@ -452,12 +518,25 @@
         <w:t xml:space="preserve">...     </w:t>
       </w:r>
       <w:proofErr w:type="spellStart"/>
-      <w:r>
-        <w:t>db.create_all</w:t>
+      <w:proofErr w:type="gramStart"/>
+      <w:r>
+        <w:t>db.create</w:t>
+      </w:r>
+      <w:proofErr w:type="gramEnd"/>
+      <w:r>
+        <w:t>_</w:t>
+      </w:r>
+      <w:proofErr w:type="gramStart"/>
+      <w:r>
+        <w:t>all</w:t>
       </w:r>
       <w:proofErr w:type="spellEnd"/>
       <w:r>
-        <w:t>()</w:t>
+        <w:t>(</w:t>
+      </w:r>
+      <w:proofErr w:type="gramEnd"/>
+      <w:r>
+        <w:t>)</w:t>
       </w:r>
     </w:p>
     <w:p>
@@ -468,12 +547,17 @@
         <w:t xml:space="preserve">...     </w:t>
       </w:r>
       <w:proofErr w:type="spellStart"/>
+      <w:proofErr w:type="gramStart"/>
       <w:r>
         <w:t>exit</w:t>
       </w:r>
       <w:proofErr w:type="spellEnd"/>
       <w:r>
-        <w:t>()</w:t>
+        <w:t>(</w:t>
+      </w:r>
+      <w:proofErr w:type="gramEnd"/>
+      <w:r>
+        <w:t>)</w:t>
       </w:r>
     </w:p>
     <w:p>
@@ -580,16 +664,51 @@
         <w:t xml:space="preserve"> (complexo)</w:t>
       </w:r>
     </w:p>
+    <w:p>
+      <w:pPr>
+        <w:spacing w:after="0" w:line="240" w:lineRule="auto"/>
+      </w:pPr>
+    </w:p>
+    <w:p>
+      <w:pPr>
+        <w:spacing w:after="0" w:line="240" w:lineRule="auto"/>
+      </w:pPr>
+    </w:p>
+    <w:p>
+      <w:pPr>
+        <w:spacing w:after="0" w:line="240" w:lineRule="auto"/>
+      </w:pPr>
+    </w:p>
+    <w:p>
+      <w:pPr>
+        <w:spacing w:after="0" w:line="240" w:lineRule="auto"/>
+        <w:rPr>
+          <w:b/>
+          <w:bCs/>
+          <w:color w:val="EE0000"/>
+        </w:rPr>
+      </w:pPr>
+      <w:r>
+        <w:rPr>
+          <w:b/>
+          <w:bCs/>
+          <w:color w:val="EE0000"/>
+        </w:rPr>
+        <w:t>https://clinica-odontologica-a1ki.onrender.com/reset-banco-2026</w:t>
+      </w:r>
+    </w:p>
+    <w:p>
+      <w:pPr>
+        <w:spacing w:after="0" w:line="240" w:lineRule="auto"/>
+      </w:pPr>
+      <w:r>
+        <w:t>para limpar o banco de dados</w:t>
+      </w:r>
+    </w:p>
     <w:p/>
     <w:p/>
     <w:p/>
-    <w:p>
-      <w:pPr>
-        <w:rPr>
-          <w:lang w:val="en-US"/>
-        </w:rPr>
-      </w:pPr>
-    </w:p>
+    <w:p/>
     <w:sectPr>
       <w:pgSz w:w="11906" w:h="16838"/>
       <w:pgMar w:top="1417" w:right="1701" w:bottom="1417" w:left="1701" w:header="708" w:footer="708" w:gutter="0"/>

</xml_diff>